<commit_message>
Mark 4 leads as confirmed No via override
Rubio Attorneys, Pathlight Legal, SLC Law Office, Wattel & York confirmed
declined by rep; override estimate to No across reports, action plan, and
re-engagement audience (now 207 leads). Refresh sequence doc counts.

Co-Authored-By: Claude Opus 4.8 <noreply@anthropic.com>
Claude-Session: https://claude.ai/code/session_0188Gg43mP68tZqBh1g3KVvC
</commit_message>
<xml_diff>
--- a/MBP_ReEngagement_Sequence.docx
+++ b/MBP_ReEngagement_Sequence.docx
@@ -35,7 +35,7 @@
         <w:pStyle w:val="ListBullet"/>
       </w:pPr>
       <w:r>
-        <w:t>reengage-hot (39) — had a meeting / booked, no decision yet. Closest to signing.</w:t>
+        <w:t>reengage-hot (36) — had a meeting / booked, no decision yet. Closest to signing.</w:t>
       </w:r>
     </w:p>
     <w:p>
@@ -43,7 +43,7 @@
         <w:pStyle w:val="ListBullet"/>
       </w:pPr>
       <w:r>
-        <w:t>reengage-warm (44) — asked for a meeting, never scheduled. Get them on the calendar.</w:t>
+        <w:t>reengage-warm (43) — asked for a meeting, never scheduled. Get them on the calendar.</w:t>
       </w:r>
     </w:p>
     <w:p>

</xml_diff>